<commit_message>
Agregar requisito de foliacion en lineamientos y formato de transferencia documental
</commit_message>
<xml_diff>
--- a/Formato_Transferencia_Documental_Primaria_2026.docx
+++ b/Formato_Transferencia_Documental_Primaria_2026.docx
@@ -132,6 +132,12 @@
       </w:tr>
     </w:tbl>
     <w:p/>
+    <w:p>
+      <w:pPr/>
+      <w:r>
+        <w:t>La documentación relacionada en este formato debe entregarse debidamente foliada por el área productora (numeración consecutiva en el margen superior derecho de cada hoja), como requisito previo e indispensable para su recepción por parte del archivo central.</w:t>
+      </w:r>
+    </w:p>
     <w:p>
       <w:pPr>
         <w:jc w:val="both"/>

</xml_diff>